<commit_message>
Compress the docs videos, and finish the documentation site
</commit_message>
<xml_diff>
--- a/embed-cd-page-writeup.docx
+++ b/embed-cd-page-writeup.docx
@@ -1,7 +1,58 @@
 
 <file path=word/document.xml><?xml version="1.0" encoding="utf-8"?>
-<w:document xmlns:wpc="http://schemas.microsoft.com/office/word/2010/wordprocessingCanvas" xmlns:cx="http://schemas.microsoft.com/office/drawing/2014/chartex" xmlns:cx1="http://schemas.microsoft.com/office/drawing/2015/9/8/chartex" xmlns:cx2="http://schemas.microsoft.com/office/drawing/2015/10/21/chartex" xmlns:cx3="http://schemas.microsoft.com/office/drawing/2016/5/9/chartex" xmlns:cx4="http://schemas.microsoft.com/office/drawing/2016/5/10/chartex" xmlns:cx5="http://schemas.microsoft.com/office/drawing/2016/5/11/chartex" xmlns:cx6="http://schemas.microsoft.com/office/drawing/2016/5/12/chartex" xmlns:cx7="http://schemas.microsoft.com/office/drawing/2016/5/13/chartex" xmlns:cx8="http://schemas.microsoft.com/office/drawing/2016/5/14/chartex" xmlns:mc="http://schemas.openxmlformats.org/markup-compatibility/2006" xmlns:aink="http://schemas.microsoft.com/office/drawing/2016/ink" xmlns:am3d="http://schemas.microsoft.com/office/drawing/2017/model3d" xmlns:o="urn:schemas-microsoft-com:office:office" xmlns:oel="http://schemas.microsoft.com/office/2019/extlst" xmlns:r="http://schemas.openxmlformats.org/officeDocument/2006/relationships" xmlns:m="http://schemas.openxmlformats.org/officeDocument/2006/math" xmlns:v="urn:schemas-microsoft-com:vml" xmlns:wp14="http://schemas.microsoft.com/office/word/2010/wordprocessingDrawing" xmlns:wp="http://schemas.openxmlformats.org/drawingml/2006/wordprocessingDrawing" xmlns:w10="urn:schemas-microsoft-com:office:word" xmlns:w="http://schemas.openxmlformats.org/wordprocessingml/2006/main" xmlns:w14="http://schemas.microsoft.com/office/word/2010/wordml" xmlns:w15="http://schemas.microsoft.com/office/word/2012/wordml" xmlns:w16cei="http://schemas.microsoft.com/office/word/2026/wordml/cei" xmlns:w16cex="http://schemas.microsoft.com/office/word/2018/wordml/cex" xmlns:w16cid="http://schemas.microsoft.com/office/word/2016/wordml/cid" xmlns:w16="http://schemas.microsoft.com/office/word/2018/wordml" xmlns:w16du="http://schemas.microsoft.com/office/word/2023/wordml/word16du" xmlns:w16sdtdh="http://schemas.microsoft.com/office/word/2020/wordml/sdtdatahash" xmlns:w16sdtfl="http://schemas.microsoft.com/office/word/2024/wordml/sdtformatlock" xmlns:w16se="http://schemas.microsoft.com/office/word/2015/wordml/symex" xmlns:wpg="http://schemas.microsoft.com/office/word/2010/wordprocessingGroup" xmlns:wpi="http://schemas.microsoft.com/office/word/2010/wordprocessingInk" xmlns:wne="http://schemas.microsoft.com/office/word/2006/wordml" xmlns:wps="http://schemas.microsoft.com/office/word/2010/wordprocessingShape" mc:Ignorable="w14 w15 w16se w16cid w16 w16cex w16sdtdh w16sdtfl w16du wp14">
+<w:document xmlns:wpc="http://schemas.microsoft.com/office/word/2010/wordprocessingCanvas" xmlns:cx="http://schemas.microsoft.com/office/drawing/2014/chartex" xmlns:cx1="http://schemas.microsoft.com/office/drawing/2015/9/8/chartex" xmlns:cx2="http://schemas.microsoft.com/office/drawing/2015/10/21/chartex" xmlns:cx3="http://schemas.microsoft.com/office/drawing/2016/5/9/chartex" xmlns:cx4="http://schemas.microsoft.com/office/drawing/2016/5/10/chartex" xmlns:cx5="http://schemas.microsoft.com/office/drawing/2016/5/11/chartex" xmlns:cx6="http://schemas.microsoft.com/office/drawing/2016/5/12/chartex" xmlns:cx7="http://schemas.microsoft.com/office/drawing/2016/5/13/chartex" xmlns:cx8="http://schemas.microsoft.com/office/drawing/2016/5/14/chartex" xmlns:mc="http://schemas.openxmlformats.org/markup-compatibility/2006" xmlns:aink="http://schemas.microsoft.com/office/drawing/2016/ink" xmlns:am3d="http://schemas.microsoft.com/office/drawing/2017/model3d" xmlns:o="urn:schemas-microsoft-com:office:office" xmlns:oel="http://schemas.microsoft.com/office/2019/extlst" xmlns:r="http://schemas.openxmlformats.org/officeDocument/2006/relationships" xmlns:m="http://schemas.openxmlformats.org/officeDocument/2006/math" xmlns:v="urn:schemas-microsoft-com:vml" xmlns:wp14="http://schemas.microsoft.com/office/word/2010/wordprocessingDrawing" xmlns:wp="http://schemas.openxmlformats.org/drawingml/2006/wordprocessingDrawing" xmlns:w10="urn:schemas-microsoft-com:office:word" xmlns:w="http://schemas.openxmlformats.org/wordprocessingml/2006/main" xmlns:w14="http://schemas.microsoft.com/office/word/2010/wordml" xmlns:w15="http://schemas.microsoft.com/office/word/2012/wordml" xmlns:w16cex="http://schemas.microsoft.com/office/word/2018/wordml/cex" xmlns:w16cid="http://schemas.microsoft.com/office/word/2016/wordml/cid" xmlns:w16="http://schemas.microsoft.com/office/word/2018/wordml" xmlns:w16du="http://schemas.microsoft.com/office/word/2023/wordml/word16du" xmlns:w16sdtdh="http://schemas.microsoft.com/office/word/2020/wordml/sdtdatahash" xmlns:w16sdtfl="http://schemas.microsoft.com/office/word/2024/wordml/sdtformatlock" xmlns:w16se="http://schemas.microsoft.com/office/word/2015/wordml/symex" xmlns:wpg="http://schemas.microsoft.com/office/word/2010/wordprocessingGroup" xmlns:wpi="http://schemas.microsoft.com/office/word/2010/wordprocessingInk" xmlns:wne="http://schemas.microsoft.com/office/word/2006/wordml" xmlns:wps="http://schemas.microsoft.com/office/word/2010/wordprocessingShape" mc:Ignorable="w14 w15 w16se w16cid w16 w16cex w16sdtdh w16sdtfl w16du wp14">
   <w:body>
+    <w:p>
+      <w:r>
+        <w:drawing>
+          <wp:inline distT="0" distB="0" distL="0" distR="0" wp14:anchorId="0AE35E6C" wp14:editId="429E1BAE">
+            <wp:extent cx="5943600" cy="3686175"/>
+            <wp:effectExtent l="0" t="0" r="0" b="9525"/>
+            <wp:docPr id="604018497" name="Picture 1"/>
+            <wp:cNvGraphicFramePr>
+              <a:graphicFrameLocks xmlns:a="http://schemas.openxmlformats.org/drawingml/2006/main" noChangeAspect="1"/>
+            </wp:cNvGraphicFramePr>
+            <a:graphic xmlns:a="http://schemas.openxmlformats.org/drawingml/2006/main">
+              <a:graphicData uri="http://schemas.openxmlformats.org/drawingml/2006/picture">
+                <pic:pic xmlns:pic="http://schemas.openxmlformats.org/drawingml/2006/picture">
+                  <pic:nvPicPr>
+                    <pic:cNvPr id="604018497" name=""/>
+                    <pic:cNvPicPr/>
+                  </pic:nvPicPr>
+                  <pic:blipFill>
+                    <a:blip r:embed="rId5"/>
+                    <a:stretch>
+                      <a:fillRect/>
+                    </a:stretch>
+                  </pic:blipFill>
+                  <pic:spPr>
+                    <a:xfrm>
+                      <a:off x="0" y="0"/>
+                      <a:ext cx="5943600" cy="3686175"/>
+                    </a:xfrm>
+                    <a:prstGeom prst="rect">
+                      <a:avLst/>
+                    </a:prstGeom>
+                  </pic:spPr>
+                </pic:pic>
+              </a:graphicData>
+            </a:graphic>
+          </wp:inline>
+        </w:drawing>
+      </w:r>
+    </w:p>
+    <w:p/>
+    <w:p>
+      <w:r>
+        <w:t>X:\3_PersonalWorking\dan\rd_rare\for_alex\images.zip</w:t>
+      </w:r>
+    </w:p>
+    <w:p>
+      <w:r>
+        <w:t> </w:t>
+      </w:r>
+    </w:p>
+    <w:p/>
     <w:p>
       <w:r>
         <w:t xml:space="preserve">Example Ideas </w:t>
@@ -9,15 +60,7 @@
     </w:p>
     <w:p>
       <w:r>
-        <w:t xml:space="preserve">Short ~40-second video clip (Isolate to </w:t>
-      </w:r>
-      <w:proofErr w:type="gramStart"/>
-      <w:r>
-        <w:t>Vancouver island</w:t>
-      </w:r>
-      <w:proofErr w:type="gramEnd"/>
-      <w:r>
-        <w:t xml:space="preserve">) </w:t>
+        <w:t xml:space="preserve">Short ~40-second video clip (Isolate to Vancouver island) </w:t>
       </w:r>
     </w:p>
     <w:p>
@@ -41,15 +84,7 @@
         </w:numPr>
       </w:pPr>
       <w:r>
-        <w:t>Generate change map over small area (</w:t>
-      </w:r>
-      <w:proofErr w:type="gramStart"/>
-      <w:r>
-        <w:t>high-res</w:t>
-      </w:r>
-      <w:proofErr w:type="gramEnd"/>
-      <w:r>
-        <w:t xml:space="preserve">) and show changes with threshold adjustments (maybe show over Victoria BC) </w:t>
+        <w:t xml:space="preserve">Generate change map over small area (high-res) and show changes with threshold adjustments (maybe show over Victoria BC) </w:t>
       </w:r>
     </w:p>
     <w:p>
@@ -61,23 +96,7 @@
         </w:numPr>
       </w:pPr>
       <w:r>
-        <w:t xml:space="preserve">Zoom out and explain how this can also be done at scale –show </w:t>
-      </w:r>
-      <w:proofErr w:type="gramStart"/>
-      <w:r>
-        <w:t>all of</w:t>
-      </w:r>
-      <w:proofErr w:type="gramEnd"/>
-      <w:r>
-        <w:t xml:space="preserve"> </w:t>
-      </w:r>
-      <w:proofErr w:type="gramStart"/>
-      <w:r>
-        <w:t>Vancouver island</w:t>
-      </w:r>
-      <w:proofErr w:type="gramEnd"/>
-      <w:r>
-        <w:t xml:space="preserve"> running – timelapse it? </w:t>
+        <w:t xml:space="preserve">Zoom out and explain how this can also be done at scale –show all of Vancouver island running – timelapse it? </w:t>
       </w:r>
     </w:p>
     <w:p>
@@ -160,7 +179,7 @@
 </file>
 
 <file path=word/numbering.xml><?xml version="1.0" encoding="utf-8"?>
-<w:numbering xmlns:wpc="http://schemas.microsoft.com/office/word/2010/wordprocessingCanvas" xmlns:cx="http://schemas.microsoft.com/office/drawing/2014/chartex" xmlns:cx1="http://schemas.microsoft.com/office/drawing/2015/9/8/chartex" xmlns:cx2="http://schemas.microsoft.com/office/drawing/2015/10/21/chartex" xmlns:cx3="http://schemas.microsoft.com/office/drawing/2016/5/9/chartex" xmlns:cx4="http://schemas.microsoft.com/office/drawing/2016/5/10/chartex" xmlns:cx5="http://schemas.microsoft.com/office/drawing/2016/5/11/chartex" xmlns:cx6="http://schemas.microsoft.com/office/drawing/2016/5/12/chartex" xmlns:cx7="http://schemas.microsoft.com/office/drawing/2016/5/13/chartex" xmlns:cx8="http://schemas.microsoft.com/office/drawing/2016/5/14/chartex" xmlns:mc="http://schemas.openxmlformats.org/markup-compatibility/2006" xmlns:aink="http://schemas.microsoft.com/office/drawing/2016/ink" xmlns:am3d="http://schemas.microsoft.com/office/drawing/2017/model3d" xmlns:o="urn:schemas-microsoft-com:office:office" xmlns:oel="http://schemas.microsoft.com/office/2019/extlst" xmlns:r="http://schemas.openxmlformats.org/officeDocument/2006/relationships" xmlns:m="http://schemas.openxmlformats.org/officeDocument/2006/math" xmlns:v="urn:schemas-microsoft-com:vml" xmlns:wp14="http://schemas.microsoft.com/office/word/2010/wordprocessingDrawing" xmlns:wp="http://schemas.openxmlformats.org/drawingml/2006/wordprocessingDrawing" xmlns:w10="urn:schemas-microsoft-com:office:word" xmlns:w="http://schemas.openxmlformats.org/wordprocessingml/2006/main" xmlns:w14="http://schemas.microsoft.com/office/word/2010/wordml" xmlns:w15="http://schemas.microsoft.com/office/word/2012/wordml" xmlns:w16cei="http://schemas.microsoft.com/office/word/2026/wordml/cei" xmlns:w16cex="http://schemas.microsoft.com/office/word/2018/wordml/cex" xmlns:w16cid="http://schemas.microsoft.com/office/word/2016/wordml/cid" xmlns:w16="http://schemas.microsoft.com/office/word/2018/wordml" xmlns:w16du="http://schemas.microsoft.com/office/word/2023/wordml/word16du" xmlns:w16sdtdh="http://schemas.microsoft.com/office/word/2020/wordml/sdtdatahash" xmlns:w16sdtfl="http://schemas.microsoft.com/office/word/2024/wordml/sdtformatlock" xmlns:w16se="http://schemas.microsoft.com/office/word/2015/wordml/symex" xmlns:wpg="http://schemas.microsoft.com/office/word/2010/wordprocessingGroup" xmlns:wpi="http://schemas.microsoft.com/office/word/2010/wordprocessingInk" xmlns:wne="http://schemas.microsoft.com/office/word/2006/wordml" xmlns:wps="http://schemas.microsoft.com/office/word/2010/wordprocessingShape" mc:Ignorable="w14 w15 w16se w16cid w16 w16cex w16sdtdh w16sdtfl w16du wp14">
+<w:numbering xmlns:wpc="http://schemas.microsoft.com/office/word/2010/wordprocessingCanvas" xmlns:cx="http://schemas.microsoft.com/office/drawing/2014/chartex" xmlns:cx1="http://schemas.microsoft.com/office/drawing/2015/9/8/chartex" xmlns:cx2="http://schemas.microsoft.com/office/drawing/2015/10/21/chartex" xmlns:cx3="http://schemas.microsoft.com/office/drawing/2016/5/9/chartex" xmlns:cx4="http://schemas.microsoft.com/office/drawing/2016/5/10/chartex" xmlns:cx5="http://schemas.microsoft.com/office/drawing/2016/5/11/chartex" xmlns:cx6="http://schemas.microsoft.com/office/drawing/2016/5/12/chartex" xmlns:cx7="http://schemas.microsoft.com/office/drawing/2016/5/13/chartex" xmlns:cx8="http://schemas.microsoft.com/office/drawing/2016/5/14/chartex" xmlns:mc="http://schemas.openxmlformats.org/markup-compatibility/2006" xmlns:aink="http://schemas.microsoft.com/office/drawing/2016/ink" xmlns:am3d="http://schemas.microsoft.com/office/drawing/2017/model3d" xmlns:o="urn:schemas-microsoft-com:office:office" xmlns:oel="http://schemas.microsoft.com/office/2019/extlst" xmlns:r="http://schemas.openxmlformats.org/officeDocument/2006/relationships" xmlns:m="http://schemas.openxmlformats.org/officeDocument/2006/math" xmlns:v="urn:schemas-microsoft-com:vml" xmlns:wp14="http://schemas.microsoft.com/office/word/2010/wordprocessingDrawing" xmlns:wp="http://schemas.openxmlformats.org/drawingml/2006/wordprocessingDrawing" xmlns:w10="urn:schemas-microsoft-com:office:word" xmlns:w="http://schemas.openxmlformats.org/wordprocessingml/2006/main" xmlns:w14="http://schemas.microsoft.com/office/word/2010/wordml" xmlns:w15="http://schemas.microsoft.com/office/word/2012/wordml" xmlns:w16cex="http://schemas.microsoft.com/office/word/2018/wordml/cex" xmlns:w16cid="http://schemas.microsoft.com/office/word/2016/wordml/cid" xmlns:w16="http://schemas.microsoft.com/office/word/2018/wordml" xmlns:w16du="http://schemas.microsoft.com/office/word/2023/wordml/word16du" xmlns:w16sdtdh="http://schemas.microsoft.com/office/word/2020/wordml/sdtdatahash" xmlns:w16sdtfl="http://schemas.microsoft.com/office/word/2024/wordml/sdtformatlock" xmlns:w16se="http://schemas.microsoft.com/office/word/2015/wordml/symex" xmlns:wpg="http://schemas.microsoft.com/office/word/2010/wordprocessingGroup" xmlns:wpi="http://schemas.microsoft.com/office/word/2010/wordprocessingInk" xmlns:wne="http://schemas.microsoft.com/office/word/2006/wordml" xmlns:wps="http://schemas.microsoft.com/office/word/2010/wordprocessingShape" mc:Ignorable="w14 w15 w16se w16cid w16 w16cex w16sdtdh w16sdtfl w16du wp14">
   <w:abstractNum w:abstractNumId="0" w15:restartNumberingAfterBreak="0">
     <w:nsid w:val="40431E2D"/>
     <w:multiLevelType w:val="hybridMultilevel"/>
@@ -883,7 +902,6 @@
   <w:style w:type="character" w:default="1" w:styleId="DefaultParagraphFont">
     <w:name w:val="Default Paragraph Font"/>
     <w:uiPriority w:val="1"/>
-    <w:semiHidden/>
     <w:unhideWhenUsed/>
   </w:style>
   <w:style w:type="table" w:default="1" w:styleId="TableNormal">

</xml_diff>